<commit_message>
refactor: switch from layer model to rows
</commit_message>
<xml_diff>
--- a/Assets/ГДД.docx
+++ b/Assets/ГДД.docx
@@ -5,17 +5,13 @@
     <w:p>
       <w:pPr>
         <w:pStyle w:val="1"/>
-        <w:ind w:firstLine="0"/>
         <w:jc w:val="center"/>
-        <w:rPr>
+      </w:pPr>
+      <w:r>
+        <w:rPr>
+          <w:color w:val="000000"/>
           <w:sz w:val="28"/>
-          <w:szCs w:val="44"/>
-        </w:rPr>
-      </w:pPr>
-      <w:r>
-        <w:rPr>
-          <w:sz w:val="28"/>
-          <w:szCs w:val="44"/>
+          <w:szCs w:val="28"/>
         </w:rPr>
         <w:t>Анализ референса</w:t>
       </w:r>
@@ -25,63 +21,63 @@
         <w:pStyle w:val="1"/>
       </w:pPr>
       <w:r>
+        <w:rPr>
+          <w:color w:val="000000"/>
+          <w:szCs w:val="24"/>
+        </w:rPr>
         <w:t>Общее описание</w:t>
       </w:r>
     </w:p>
     <w:p>
-      <w:r>
-        <w:t xml:space="preserve">Игрок переставляет предметы на полках, пытаясь собрать 3 одинаковых предмета на одной полке. При этом собранные </w:t>
-      </w:r>
-      <w:r>
-        <w:t xml:space="preserve">на одной полке </w:t>
-      </w:r>
-      <w:r>
-        <w:t xml:space="preserve">3 предмета пропадают, освобождая </w:t>
-      </w:r>
-      <w:r>
-        <w:t>свои ячейки</w:t>
-      </w:r>
-      <w:r>
-        <w:t xml:space="preserve">. Цель игрока – расставить все одинаковые предметы на полках за </w:t>
-      </w:r>
-      <w:r>
-        <w:t xml:space="preserve">отведенное </w:t>
-      </w:r>
-      <w:r>
-        <w:t>время</w:t>
-      </w:r>
-      <w:r>
-        <w:t>, чтобы на полках не осталось ни одного предмета</w:t>
-      </w:r>
-      <w:r>
-        <w:t>.</w:t>
-      </w:r>
-    </w:p>
-    <w:p>
-      <w:r>
-        <w:t xml:space="preserve">Жанр: Три в </w:t>
-      </w:r>
-      <w:proofErr w:type="gramStart"/>
-      <w:r>
-        <w:t>ряд?;</w:t>
-      </w:r>
-      <w:proofErr w:type="gramEnd"/>
-    </w:p>
-    <w:p>
-      <w:r>
-        <w:t xml:space="preserve">Стиль: Мультяшный </w:t>
-      </w:r>
-      <w:proofErr w:type="spellStart"/>
-      <w:r>
-        <w:t>лоу</w:t>
-      </w:r>
-      <w:proofErr w:type="spellEnd"/>
-      <w:r>
-        <w:t>-поли;</w:t>
-      </w:r>
-    </w:p>
-    <w:p>
-      <w:r>
+      <w:pPr>
+        <w:pStyle w:val="af"/>
+        <w:spacing w:before="0" w:beforeAutospacing="0" w:after="0" w:afterAutospacing="0"/>
+        <w:ind w:firstLine="709"/>
+        <w:jc w:val="both"/>
+      </w:pPr>
+      <w:r>
+        <w:rPr>
+          <w:color w:val="000000"/>
+        </w:rPr>
+        <w:t>Игрок переставляет предметы на полках, пытаясь собрать 3 одинаковых предмета на одной полке. При этом собранные на одной полке 3 предмета пропадают, освобождая свои ячейки. Цель игрока – расставить все одинаковые предметы на полках за минимальное время, чтобы на полках не осталось ни одного предмета.</w:t>
+      </w:r>
+    </w:p>
+    <w:p>
+      <w:pPr>
+        <w:pStyle w:val="af"/>
+        <w:spacing w:before="0" w:beforeAutospacing="0" w:after="0" w:afterAutospacing="0"/>
+        <w:ind w:firstLine="709"/>
+      </w:pPr>
+      <w:r>
+        <w:rPr>
+          <w:color w:val="000000"/>
+        </w:rPr>
+        <w:t>Жанр: Три в ряд;</w:t>
+      </w:r>
+    </w:p>
+    <w:p>
+      <w:pPr>
+        <w:pStyle w:val="af"/>
+        <w:spacing w:before="0" w:beforeAutospacing="0" w:after="0" w:afterAutospacing="0"/>
+        <w:ind w:firstLine="709"/>
+      </w:pPr>
+      <w:r>
+        <w:rPr>
+          <w:color w:val="000000"/>
+        </w:rPr>
+        <w:t>Стиль: Мультяшный лоу-поли;</w:t>
+      </w:r>
+    </w:p>
+    <w:p>
+      <w:pPr>
+        <w:pStyle w:val="af"/>
+        <w:spacing w:before="0" w:beforeAutospacing="0" w:after="0" w:afterAutospacing="0"/>
+        <w:ind w:firstLine="709"/>
+      </w:pPr>
+      <w:r>
+        <w:rPr>
+          <w:color w:val="000000"/>
+        </w:rPr>
         <w:t>Сеттинг: Домашний интерьер, кладовая, бытовые предметы.</w:t>
       </w:r>
     </w:p>
@@ -91,40 +87,24 @@
         <w:pStyle w:val="1"/>
       </w:pPr>
       <w:r>
+        <w:rPr>
+          <w:color w:val="000000"/>
+          <w:szCs w:val="24"/>
+        </w:rPr>
         <w:t>Основная механика:</w:t>
       </w:r>
     </w:p>
     <w:p>
-      <w:r>
-        <w:softHyphen/>
-        <w:t> </w:t>
-      </w:r>
-      <w:r>
-        <w:t>Игрок перемещает</w:t>
-      </w:r>
-      <w:r>
-        <w:t xml:space="preserve"> предмет</w:t>
-      </w:r>
-      <w:r>
-        <w:t>ы</w:t>
-      </w:r>
-      <w:r>
-        <w:t xml:space="preserve"> между одно</w:t>
-      </w:r>
-      <w:r>
-        <w:t>й</w:t>
-      </w:r>
-      <w:r>
-        <w:t xml:space="preserve"> из трех </w:t>
-      </w:r>
-      <w:r>
-        <w:t>ячеек</w:t>
-      </w:r>
-      <w:r>
-        <w:t xml:space="preserve"> на каждой из полок</w:t>
-      </w:r>
-      <w:r>
-        <w:t>;</w:t>
+      <w:pPr>
+        <w:pStyle w:val="af"/>
+        <w:spacing w:before="0" w:beforeAutospacing="0" w:after="0" w:afterAutospacing="0"/>
+        <w:ind w:firstLine="709"/>
+      </w:pPr>
+      <w:r>
+        <w:rPr>
+          <w:color w:val="000000"/>
+        </w:rPr>
+        <w:t> Игрок перемещает предметы между одной из трех ячеек на каждой из полок;</w:t>
       </w:r>
     </w:p>
     <w:p/>
@@ -133,62 +113,95 @@
         <w:pStyle w:val="1"/>
       </w:pPr>
       <w:r>
+        <w:rPr>
+          <w:color w:val="000000"/>
+          <w:szCs w:val="24"/>
+        </w:rPr>
         <w:t>Вторичные механики:</w:t>
       </w:r>
     </w:p>
     <w:p>
       <w:pPr>
-        <w:pStyle w:val="a7"/>
+        <w:pStyle w:val="af"/>
         <w:numPr>
           <w:ilvl w:val="0"/>
-          <w:numId w:val="5"/>
+          <w:numId w:val="7"/>
         </w:numPr>
-      </w:pPr>
-      <w:r>
-        <w:softHyphen/>
+        <w:spacing w:before="0" w:beforeAutospacing="0" w:after="0" w:afterAutospacing="0"/>
+        <w:ind w:left="1429"/>
+        <w:textAlignment w:val="baseline"/>
+        <w:rPr>
+          <w:color w:val="000000"/>
+        </w:rPr>
+      </w:pPr>
+      <w:r>
+        <w:rPr>
+          <w:color w:val="000000"/>
+        </w:rPr>
         <w:t> подсчет комбо, при быстром успешном складывании предметов на полке;</w:t>
       </w:r>
     </w:p>
     <w:p>
       <w:pPr>
-        <w:pStyle w:val="a7"/>
+        <w:pStyle w:val="af"/>
         <w:numPr>
           <w:ilvl w:val="0"/>
-          <w:numId w:val="5"/>
+          <w:numId w:val="7"/>
         </w:numPr>
-      </w:pPr>
-      <w:r>
-        <w:softHyphen/>
+        <w:spacing w:before="0" w:beforeAutospacing="0" w:after="0" w:afterAutospacing="0"/>
+        <w:ind w:left="1429"/>
+        <w:textAlignment w:val="baseline"/>
+        <w:rPr>
+          <w:color w:val="000000"/>
+        </w:rPr>
+      </w:pPr>
+      <w:r>
+        <w:rPr>
+          <w:color w:val="000000"/>
+        </w:rPr>
         <w:t> за главным рядом с предметами могут быть другие предметы, которые можно будет перемещать, как только полка освободиться от предыдущих;</w:t>
       </w:r>
     </w:p>
     <w:p>
       <w:pPr>
-        <w:pStyle w:val="a7"/>
+        <w:pStyle w:val="af"/>
         <w:numPr>
           <w:ilvl w:val="0"/>
-          <w:numId w:val="5"/>
+          <w:numId w:val="7"/>
         </w:numPr>
-      </w:pPr>
-      <w:r>
-        <w:softHyphen/>
-        <w:t> дополнительные ряды с предметами отображаются полупрозрачно</w:t>
-      </w:r>
-      <w:r>
-        <w:t>;</w:t>
-      </w:r>
-    </w:p>
-    <w:p>
-      <w:pPr>
-        <w:pStyle w:val="a7"/>
+        <w:spacing w:before="0" w:beforeAutospacing="0" w:after="0" w:afterAutospacing="0"/>
+        <w:ind w:left="1429"/>
+        <w:textAlignment w:val="baseline"/>
+        <w:rPr>
+          <w:color w:val="000000"/>
+        </w:rPr>
+      </w:pPr>
+      <w:r>
+        <w:rPr>
+          <w:color w:val="000000"/>
+        </w:rPr>
+        <w:t> дополнительные ряды с предметами отображаются полупрозрачно;</w:t>
+      </w:r>
+    </w:p>
+    <w:p>
+      <w:pPr>
+        <w:pStyle w:val="af"/>
         <w:numPr>
           <w:ilvl w:val="0"/>
-          <w:numId w:val="5"/>
+          <w:numId w:val="7"/>
         </w:numPr>
-      </w:pPr>
-      <w:r>
-        <w:softHyphen/>
-        <w:t> система подсказок, видимо при нажатии отображает возможный вариант сложения предметов.</w:t>
+        <w:spacing w:before="0" w:beforeAutospacing="0" w:after="0" w:afterAutospacing="0"/>
+        <w:ind w:left="1429"/>
+        <w:textAlignment w:val="baseline"/>
+        <w:rPr>
+          <w:color w:val="000000"/>
+        </w:rPr>
+      </w:pPr>
+      <w:r>
+        <w:rPr>
+          <w:color w:val="000000"/>
+        </w:rPr>
+        <w:t> система подсказок, при нажатии отображает возможный вариант сложения предметов.</w:t>
       </w:r>
     </w:p>
     <w:p/>
@@ -197,40 +210,52 @@
         <w:pStyle w:val="1"/>
       </w:pPr>
       <w:r>
+        <w:rPr>
+          <w:color w:val="000000"/>
+          <w:szCs w:val="24"/>
+        </w:rPr>
         <w:t>Особенности:</w:t>
       </w:r>
     </w:p>
     <w:p>
       <w:pPr>
-        <w:pStyle w:val="a7"/>
+        <w:pStyle w:val="af"/>
         <w:numPr>
           <w:ilvl w:val="0"/>
-          <w:numId w:val="6"/>
+          <w:numId w:val="8"/>
         </w:numPr>
-      </w:pPr>
-      <w:r>
-        <w:softHyphen/>
-        <w:t xml:space="preserve"> при складывании трех предметов они </w:t>
-      </w:r>
-      <w:proofErr w:type="spellStart"/>
-      <w:r>
-        <w:t>примагничиваются</w:t>
-      </w:r>
-      <w:proofErr w:type="spellEnd"/>
-      <w:r>
-        <w:t xml:space="preserve"> в центр и возникает эффект взрыва. Также из условного центра вылетают звездочки для подсчета очков на уровне.</w:t>
-      </w:r>
-    </w:p>
-    <w:p>
-      <w:pPr>
-        <w:pStyle w:val="a7"/>
+        <w:spacing w:before="0" w:beforeAutospacing="0" w:after="0" w:afterAutospacing="0"/>
+        <w:ind w:left="1429"/>
+        <w:textAlignment w:val="baseline"/>
+        <w:rPr>
+          <w:color w:val="000000"/>
+        </w:rPr>
+      </w:pPr>
+      <w:r>
+        <w:rPr>
+          <w:color w:val="000000"/>
+        </w:rPr>
+        <w:t> при складывании трех предметов они примагничиваются в центр и возникает эффект взрыва. Также из условного центра вылетают звездочки для подсчета очков на уровне.</w:t>
+      </w:r>
+    </w:p>
+    <w:p>
+      <w:pPr>
+        <w:pStyle w:val="af"/>
         <w:numPr>
           <w:ilvl w:val="0"/>
-          <w:numId w:val="6"/>
+          <w:numId w:val="8"/>
         </w:numPr>
-      </w:pPr>
-      <w:r>
-        <w:softHyphen/>
+        <w:spacing w:before="0" w:beforeAutospacing="0" w:after="0" w:afterAutospacing="0"/>
+        <w:ind w:left="1429"/>
+        <w:textAlignment w:val="baseline"/>
+        <w:rPr>
+          <w:color w:val="000000"/>
+        </w:rPr>
+      </w:pPr>
+      <w:r>
+        <w:rPr>
+          <w:color w:val="000000"/>
+        </w:rPr>
         <w:t> удобно отображаются следующие ряды с предметами. Визуально выглядят как фантомные, еще недоступные, но открывающиеся при зачистке текущего ряда.</w:t>
       </w:r>
     </w:p>
@@ -240,183 +265,169 @@
         <w:pStyle w:val="1"/>
       </w:pPr>
       <w:r>
+        <w:rPr>
+          <w:color w:val="000000"/>
+          <w:szCs w:val="24"/>
+        </w:rPr>
         <w:t>Недостатки:</w:t>
       </w:r>
     </w:p>
     <w:p>
       <w:pPr>
-        <w:pStyle w:val="a7"/>
+        <w:pStyle w:val="af"/>
         <w:numPr>
           <w:ilvl w:val="0"/>
-          <w:numId w:val="4"/>
+          <w:numId w:val="9"/>
         </w:numPr>
-      </w:pPr>
-      <w:r>
-        <w:softHyphen/>
-      </w:r>
-      <w:r>
-        <w:rPr>
-          <w:lang w:val="en-US"/>
-        </w:rPr>
-        <w:t> </w:t>
-      </w:r>
-      <w:r>
-        <w:t xml:space="preserve">Чтобы открыть предметы для текущего ряда, необходимо полностью зачистить текущий ряд. Это может быть </w:t>
-      </w:r>
-      <w:r>
-        <w:t xml:space="preserve">странным, в </w:t>
-      </w:r>
-      <w:r>
-        <w:t>случае,</w:t>
-      </w:r>
-      <w:r>
-        <w:t xml:space="preserve"> когда на одном и втором ряду остались предметы одного типа, которые могли бы сложиться </w:t>
-      </w:r>
-      <w:r>
-        <w:lastRenderedPageBreak/>
-        <w:t>(особенно круто было бы одним действием вызвать цепочку сложений – круче комбо)</w:t>
-      </w:r>
-      <w:r>
-        <w:t>;</w:t>
-      </w:r>
-    </w:p>
-    <w:p>
-      <w:r>
-        <w:softHyphen/>
-        <w:t> Геймплей крайне примитивен</w:t>
-      </w:r>
-      <w:r>
-        <w:t>;</w:t>
-      </w:r>
-    </w:p>
-    <w:p>
-      <w:pPr>
-        <w:pStyle w:val="a7"/>
+        <w:spacing w:before="0" w:beforeAutospacing="0" w:after="0" w:afterAutospacing="0"/>
+        <w:ind w:left="1429"/>
+        <w:textAlignment w:val="baseline"/>
+        <w:rPr>
+          <w:color w:val="000000"/>
+        </w:rPr>
+      </w:pPr>
+      <w:r>
+        <w:rPr>
+          <w:color w:val="000000"/>
+        </w:rPr>
+        <w:t> Чтобы открыть предметы для текущего ряда, необходимо полностью зачистить текущий ряд. Это может быть странным, в случае, когда на одном и втором ряду остались предметы одного типа, которые могли бы сложиться (особенно круто было бы одним действием вызвать цепочку сложений – круче комбо);</w:t>
+      </w:r>
+    </w:p>
+    <w:p>
+      <w:pPr>
+        <w:pStyle w:val="af"/>
+        <w:spacing w:before="0" w:beforeAutospacing="0" w:after="0" w:afterAutospacing="0"/>
+        <w:ind w:firstLine="709"/>
+      </w:pPr>
+      <w:r>
+        <w:rPr>
+          <w:color w:val="000000"/>
+        </w:rPr>
+        <w:t> Геймплей крайне примитивен;</w:t>
+      </w:r>
+    </w:p>
+    <w:p>
+      <w:pPr>
+        <w:pStyle w:val="af"/>
         <w:numPr>
           <w:ilvl w:val="0"/>
-          <w:numId w:val="4"/>
+          <w:numId w:val="10"/>
         </w:numPr>
-      </w:pPr>
-      <w:r>
-        <w:softHyphen/>
-        <w:t> Пока из бонусов доступна только подсказка</w:t>
-      </w:r>
-      <w:r>
-        <w:t xml:space="preserve"> (Не особо </w:t>
-      </w:r>
-      <w:proofErr w:type="gramStart"/>
-      <w:r>
-        <w:t>понятно</w:t>
-      </w:r>
-      <w:proofErr w:type="gramEnd"/>
-      <w:r>
-        <w:t xml:space="preserve"> что она делает, возможно подсвечивает возможное действие для продвижения)</w:t>
-      </w:r>
-      <w:r>
-        <w:t>. Можно также добавить заморозку комбо</w:t>
-      </w:r>
-      <w:r>
-        <w:t xml:space="preserve"> (время идет также, комбо не уменьшается, но может увеличиваться)</w:t>
-      </w:r>
-      <w:r>
-        <w:t>.</w:t>
-      </w:r>
-    </w:p>
-    <w:p>
-      <w:pPr>
-        <w:pStyle w:val="a7"/>
+        <w:spacing w:before="0" w:beforeAutospacing="0" w:after="0" w:afterAutospacing="0"/>
+        <w:textAlignment w:val="baseline"/>
+        <w:rPr>
+          <w:color w:val="000000"/>
+        </w:rPr>
+      </w:pPr>
+      <w:r>
+        <w:rPr>
+          <w:color w:val="000000"/>
+        </w:rPr>
+        <w:t> Пока из бонусов доступна только подсказка. Можно также добавить заморозку комбо (время идет также, комбо не уменьшается, но может увеличиваться).</w:t>
+      </w:r>
+    </w:p>
+    <w:p>
+      <w:pPr>
+        <w:pStyle w:val="af"/>
         <w:numPr>
           <w:ilvl w:val="0"/>
-          <w:numId w:val="4"/>
+          <w:numId w:val="11"/>
         </w:numPr>
-      </w:pPr>
-      <w:r>
-        <w:softHyphen/>
-      </w:r>
-      <w:r>
-        <w:rPr>
-          <w:vertAlign w:val="subscript"/>
-        </w:rPr>
-        <w:softHyphen/>
-      </w:r>
-      <w:r>
-        <w:rPr>
-          <w:vertAlign w:val="subscript"/>
-        </w:rPr>
-        <w:softHyphen/>
-      </w:r>
-      <w:r>
-        <w:rPr>
-          <w:vertAlign w:val="subscript"/>
-        </w:rPr>
-        <w:softHyphen/>
-      </w:r>
-      <w:r>
-        <w:t xml:space="preserve"> Низкая </w:t>
-      </w:r>
-      <w:proofErr w:type="spellStart"/>
-      <w:r>
-        <w:t>реиграбельность</w:t>
-      </w:r>
-      <w:proofErr w:type="spellEnd"/>
-      <w:r>
-        <w:t>. Если предметы на полках расставляются одинокого, переигрывать уровни будет скучно. Намного интереснее добавить случайно расставленные предметы. Но встанет вопрос сложности – уровень должен всегда проходиться, и проходиться с одной и той же сложностью.</w:t>
+        <w:spacing w:before="0" w:beforeAutospacing="0" w:after="0" w:afterAutospacing="0"/>
+        <w:textAlignment w:val="baseline"/>
+        <w:rPr>
+          <w:color w:val="000000"/>
+        </w:rPr>
+      </w:pPr>
+      <w:r>
+        <w:rPr>
+          <w:color w:val="000000"/>
+        </w:rPr>
+        <w:t> Низкая реиграбельность. Если предметы на полках расставляются одинаково, переигрывать уровни будет скучно. Намного интереснее добавить случайно расставленные предметы. Но встанет вопрос сложности – уровень должен всегда проходиться, и проходиться с одной и той же сложностью.</w:t>
       </w:r>
     </w:p>
     <w:p/>
     <w:p>
       <w:pPr>
         <w:pStyle w:val="1"/>
-        <w:ind w:firstLine="0"/>
         <w:jc w:val="center"/>
-        <w:rPr>
+      </w:pPr>
+      <w:r>
+        <w:rPr>
+          <w:color w:val="000000"/>
           <w:sz w:val="28"/>
-          <w:szCs w:val="44"/>
-        </w:rPr>
-      </w:pPr>
-      <w:r>
-        <w:rPr>
-          <w:sz w:val="28"/>
-          <w:szCs w:val="44"/>
-        </w:rPr>
+          <w:szCs w:val="28"/>
+        </w:rPr>
+        <w:lastRenderedPageBreak/>
         <w:t>ГДД игры</w:t>
       </w:r>
     </w:p>
     <w:p>
-      <w:r>
+      <w:pPr>
+        <w:pStyle w:val="af"/>
+        <w:spacing w:before="0" w:beforeAutospacing="0" w:after="0" w:afterAutospacing="0"/>
+        <w:ind w:firstLine="709"/>
+      </w:pPr>
+      <w:r>
+        <w:rPr>
+          <w:color w:val="000000"/>
+        </w:rPr>
         <w:t>Повторяем референс дополняя его для улучшения игрового опыта.</w:t>
       </w:r>
     </w:p>
     <w:p>
-      <w:r>
+      <w:pPr>
+        <w:pStyle w:val="af"/>
+        <w:spacing w:before="0" w:beforeAutospacing="0" w:after="0" w:afterAutospacing="0"/>
+        <w:ind w:firstLine="709"/>
+      </w:pPr>
+      <w:r>
+        <w:rPr>
+          <w:color w:val="000000"/>
+        </w:rPr>
         <w:t>Следует добавить:</w:t>
       </w:r>
     </w:p>
     <w:p>
       <w:pPr>
-        <w:pStyle w:val="a7"/>
+        <w:pStyle w:val="af"/>
         <w:numPr>
           <w:ilvl w:val="0"/>
-          <w:numId w:val="3"/>
+          <w:numId w:val="12"/>
         </w:numPr>
-      </w:pPr>
-      <w:r>
+        <w:spacing w:before="0" w:beforeAutospacing="0" w:after="0" w:afterAutospacing="0"/>
+        <w:ind w:left="1069"/>
+        <w:textAlignment w:val="baseline"/>
+        <w:rPr>
+          <w:color w:val="000000"/>
+        </w:rPr>
+      </w:pPr>
+      <w:r>
+        <w:rPr>
+          <w:color w:val="000000"/>
+        </w:rPr>
         <w:t>Случайное расставление предметов (количество предметов каждого типа всегда одинаковое для уровня).</w:t>
       </w:r>
     </w:p>
     <w:p>
       <w:pPr>
-        <w:pStyle w:val="a7"/>
+        <w:pStyle w:val="af"/>
         <w:numPr>
           <w:ilvl w:val="0"/>
-          <w:numId w:val="3"/>
+          <w:numId w:val="12"/>
         </w:numPr>
-      </w:pPr>
-      <w:r>
-        <w:t>Придумать новые бонусы (Заморозку комбо</w:t>
-      </w:r>
-      <w:r>
-        <w:t>)</w:t>
+        <w:spacing w:before="0" w:beforeAutospacing="0" w:after="0" w:afterAutospacing="0"/>
+        <w:ind w:left="1069"/>
+        <w:textAlignment w:val="baseline"/>
+        <w:rPr>
+          <w:color w:val="000000"/>
+        </w:rPr>
+      </w:pPr>
+      <w:r>
+        <w:rPr>
+          <w:color w:val="000000"/>
+        </w:rPr>
+        <w:t>Придумать новые бонусы (Заморозку комбо)</w:t>
       </w:r>
     </w:p>
     <w:p>
@@ -424,13 +435,30 @@
         <w:pStyle w:val="1"/>
       </w:pPr>
       <w:r>
+        <w:rPr>
+          <w:color w:val="000000"/>
+          <w:szCs w:val="24"/>
+        </w:rPr>
         <w:t>Структура игры</w:t>
       </w:r>
     </w:p>
     <w:p/>
     <w:p>
-      <w:r>
+      <w:pPr>
+        <w:pStyle w:val="af"/>
+        <w:spacing w:before="0" w:beforeAutospacing="0" w:after="0" w:afterAutospacing="0"/>
+        <w:ind w:firstLine="709"/>
+      </w:pPr>
+      <w:r>
+        <w:rPr>
+          <w:color w:val="000000"/>
+        </w:rPr>
         <w:t>Общий игровой опыт приведен на схеме ниже.</w:t>
+      </w:r>
+    </w:p>
+    <w:p>
+      <w:r>
+        <w:br w:type="page"/>
       </w:r>
     </w:p>
     <w:p>
@@ -459,10 +487,10 @@
             <v:path o:extrusionok="f" gradientshapeok="t" o:connecttype="rect"/>
             <o:lock v:ext="edit" aspectratio="t"/>
           </v:shapetype>
-          <v:shape id="_x0000_i1025" type="#_x0000_t75" style="width:170.5pt;height:400.75pt" o:ole="">
+          <v:shape id="_x0000_i1025" type="#_x0000_t75" style="width:170.25pt;height:401.25pt" o:ole="">
             <v:imagedata r:id="rId6" o:title=""/>
           </v:shape>
-          <o:OLEObject Type="Embed" ProgID="Visio.Drawing.15" ShapeID="_x0000_i1025" DrawAspect="Content" ObjectID="_1844847376" r:id="rId7"/>
+          <o:OLEObject Type="Embed" ProgID="Visio.Drawing.15" ShapeID="_x0000_i1025" DrawAspect="Content" ObjectID="_1850845967" r:id="rId7"/>
         </w:object>
       </w:r>
     </w:p>
@@ -500,15 +528,7 @@
         <w:t xml:space="preserve">, список бонусов. </w:t>
       </w:r>
       <w:r>
-        <w:t xml:space="preserve">Справа отображается </w:t>
-      </w:r>
-      <w:proofErr w:type="spellStart"/>
-      <w:r>
-        <w:t>лидерборд</w:t>
-      </w:r>
-      <w:proofErr w:type="spellEnd"/>
-      <w:r>
-        <w:t xml:space="preserve"> со всеми его участниками и их заработанными очками.</w:t>
+        <w:t>Справа отображается лидерборд со всеми его участниками и их заработанными очками.</w:t>
       </w:r>
     </w:p>
     <w:p>
@@ -518,10 +538,10 @@
       </w:pPr>
       <w:r>
         <w:object w:dxaOrig="13666" w:dyaOrig="8220" w14:anchorId="04B10EAA">
-          <v:shape id="_x0000_i1036" type="#_x0000_t75" style="width:437.45pt;height:262.85pt" o:ole="">
+          <v:shape id="_x0000_i1026" type="#_x0000_t75" style="width:437.25pt;height:263.25pt" o:ole="">
             <v:imagedata r:id="rId8" o:title=""/>
           </v:shape>
-          <o:OLEObject Type="Embed" ProgID="Visio.Drawing.15" ShapeID="_x0000_i1036" DrawAspect="Content" ObjectID="_1844847377" r:id="rId9"/>
+          <o:OLEObject Type="Embed" ProgID="Visio.Drawing.15" ShapeID="_x0000_i1026" DrawAspect="Content" ObjectID="_1850845968" r:id="rId9"/>
         </w:object>
       </w:r>
     </w:p>
@@ -560,10 +580,10 @@
       </w:pPr>
       <w:r>
         <w:object w:dxaOrig="13651" w:dyaOrig="8206" w14:anchorId="786C82ED">
-          <v:shape id="_x0000_i1027" type="#_x0000_t75" style="width:442.85pt;height:266.25pt" o:ole="">
+          <v:shape id="_x0000_i1027" type="#_x0000_t75" style="width:443.25pt;height:266.25pt" o:ole="">
             <v:imagedata r:id="rId10" o:title=""/>
           </v:shape>
-          <o:OLEObject Type="Embed" ProgID="Visio.Drawing.15" ShapeID="_x0000_i1027" DrawAspect="Content" ObjectID="_1844847378" r:id="rId11"/>
+          <o:OLEObject Type="Embed" ProgID="Visio.Drawing.15" ShapeID="_x0000_i1027" DrawAspect="Content" ObjectID="_1850845969" r:id="rId11"/>
         </w:object>
       </w:r>
     </w:p>
@@ -573,10 +593,7 @@
         <w:jc w:val="center"/>
       </w:pPr>
       <w:r>
-        <w:t xml:space="preserve">Интерфейс </w:t>
-      </w:r>
-      <w:r>
-        <w:t>игрового уровня</w:t>
+        <w:t>Интерфейс игрового уровня</w:t>
       </w:r>
     </w:p>
     <w:p>
@@ -598,10 +615,10 @@
       </w:pPr>
       <w:r>
         <w:object w:dxaOrig="5731" w:dyaOrig="3840" w14:anchorId="2283429A">
-          <v:shape id="_x0000_i1050" type="#_x0000_t75" style="width:283.25pt;height:190.2pt" o:ole="">
+          <v:shape id="_x0000_i1028" type="#_x0000_t75" style="width:282.75pt;height:190.5pt" o:ole="">
             <v:imagedata r:id="rId12" o:title=""/>
           </v:shape>
-          <o:OLEObject Type="Embed" ProgID="Visio.Drawing.15" ShapeID="_x0000_i1050" DrawAspect="Content" ObjectID="_1844847379" r:id="rId13"/>
+          <o:OLEObject Type="Embed" ProgID="Visio.Drawing.15" ShapeID="_x0000_i1028" DrawAspect="Content" ObjectID="_1850845970" r:id="rId13"/>
         </w:object>
       </w:r>
     </w:p>
@@ -618,15 +635,7 @@
     <w:p/>
     <w:p>
       <w:r>
-        <w:t xml:space="preserve">В качестве декораций, предметов и полок могут использоваться следующие </w:t>
-      </w:r>
-      <w:proofErr w:type="spellStart"/>
-      <w:r>
-        <w:t>ассеты</w:t>
-      </w:r>
-      <w:proofErr w:type="spellEnd"/>
-      <w:r>
-        <w:t>:</w:t>
+        <w:t>В качестве декораций, предметов и полок могут использоваться следующие ассеты:</w:t>
       </w:r>
     </w:p>
     <w:p>
@@ -846,12 +855,10 @@
       <w:pPr>
         <w:pStyle w:val="1"/>
       </w:pPr>
-      <w:proofErr w:type="spellStart"/>
       <w:r>
         <w:lastRenderedPageBreak/>
         <w:t>Геймлпей</w:t>
       </w:r>
-      <w:proofErr w:type="spellEnd"/>
     </w:p>
     <w:p>
       <w:pPr>
@@ -907,7 +914,13 @@
         <w:ind w:firstLine="0"/>
       </w:pPr>
       <w:r>
-        <w:t>В случае сложности игрок сможет активировать заморозку комбо, которая продлиться 10 секунд. В это время комбо не уменьшается, но может увеличиваться, как и ранее.</w:t>
+        <w:t xml:space="preserve">В случае сложности игрок сможет активировать заморозку комбо, которая продлиться </w:t>
+      </w:r>
+      <w:r>
+        <w:t>3-5</w:t>
+      </w:r>
+      <w:r>
+        <w:t xml:space="preserve"> секунд. В это время комбо не уменьшается, но может увеличиваться, как и ранее.</w:t>
       </w:r>
     </w:p>
     <w:p>
@@ -965,15 +978,7 @@
         <w:t xml:space="preserve">Реклама </w:t>
       </w:r>
       <w:r>
-        <w:t xml:space="preserve">типа </w:t>
-      </w:r>
-      <w:proofErr w:type="spellStart"/>
-      <w:r>
-        <w:t>интер</w:t>
-      </w:r>
-      <w:proofErr w:type="spellEnd"/>
-      <w:r>
-        <w:t xml:space="preserve"> </w:t>
+        <w:t xml:space="preserve">типа интер </w:t>
       </w:r>
       <w:r>
         <w:t>будет показываться перед началом любого из уровней, но не перед запуском уровня сначала</w:t>
@@ -1001,6 +1006,458 @@
 <file path=word/numbering.xml><?xml version="1.0" encoding="utf-8"?>
 <w:numbering xmlns:wpc="http://schemas.microsoft.com/office/word/2010/wordprocessingCanvas" xmlns:cx="http://schemas.microsoft.com/office/drawing/2014/chartex" xmlns:cx1="http://schemas.microsoft.com/office/drawing/2015/9/8/chartex" xmlns:cx2="http://schemas.microsoft.com/office/drawing/2015/10/21/chartex" xmlns:cx3="http://schemas.microsoft.com/office/drawing/2016/5/9/chartex" xmlns:cx4="http://schemas.microsoft.com/office/drawing/2016/5/10/chartex" xmlns:cx5="http://schemas.microsoft.com/office/drawing/2016/5/11/chartex" xmlns:cx6="http://schemas.microsoft.com/office/drawing/2016/5/12/chartex" xmlns:cx7="http://schemas.microsoft.com/office/drawing/2016/5/13/chartex" xmlns:cx8="http://schemas.microsoft.com/office/drawing/2016/5/14/chartex" xmlns:mc="http://schemas.openxmlformats.org/markup-compatibility/2006" xmlns:aink="http://schemas.microsoft.com/office/drawing/2016/ink" xmlns:am3d="http://schemas.microsoft.com/office/drawing/2017/model3d" xmlns:o="urn:schemas-microsoft-com:office:office" xmlns:r="http://schemas.openxmlformats.org/officeDocument/2006/relationships" xmlns:m="http://schemas.openxmlformats.org/officeDocument/2006/math" xmlns:v="urn:schemas-microsoft-com:vml" xmlns:wp14="http://schemas.microsoft.com/office/word/2010/wordprocessingDrawing" xmlns:wp="http://schemas.openxmlformats.org/drawingml/2006/wordprocessingDrawing" xmlns:w10="urn:schemas-microsoft-com:office:word" xmlns:w="http://schemas.openxmlformats.org/wordprocessingml/2006/main" xmlns:w14="http://schemas.microsoft.com/office/word/2010/wordml" xmlns:w15="http://schemas.microsoft.com/office/word/2012/wordml" xmlns:w16cex="http://schemas.microsoft.com/office/word/2018/wordml/cex" xmlns:w16cid="http://schemas.microsoft.com/office/word/2016/wordml/cid" xmlns:w16="http://schemas.microsoft.com/office/word/2018/wordml" xmlns:w16sdtdh="http://schemas.microsoft.com/office/word/2020/wordml/sdtdatahash" xmlns:w16se="http://schemas.microsoft.com/office/word/2015/wordml/symex" xmlns:wpg="http://schemas.microsoft.com/office/word/2010/wordprocessingGroup" xmlns:wpi="http://schemas.microsoft.com/office/word/2010/wordprocessingInk" xmlns:wne="http://schemas.microsoft.com/office/word/2006/wordml" xmlns:wps="http://schemas.microsoft.com/office/word/2010/wordprocessingShape" mc:Ignorable="w14 w15 w16se w16cid w16 w16cex w16sdtdh wp14">
   <w:abstractNum w:abstractNumId="0" w15:restartNumberingAfterBreak="0">
+    <w:nsid w:val="1B7F0D55"/>
+    <w:multiLevelType w:val="multilevel"/>
+    <w:tmpl w:val="2E224922"/>
+    <w:lvl w:ilvl="0">
+      <w:start w:val="1"/>
+      <w:numFmt w:val="decimal"/>
+      <w:lvlText w:val="%1."/>
+      <w:lvlJc w:val="left"/>
+      <w:pPr>
+        <w:tabs>
+          <w:tab w:val="num" w:pos="720"/>
+        </w:tabs>
+        <w:ind w:left="720" w:hanging="360"/>
+      </w:pPr>
+    </w:lvl>
+    <w:lvl w:ilvl="1" w:tentative="1">
+      <w:start w:val="1"/>
+      <w:numFmt w:val="decimal"/>
+      <w:lvlText w:val="%2."/>
+      <w:lvlJc w:val="left"/>
+      <w:pPr>
+        <w:tabs>
+          <w:tab w:val="num" w:pos="1440"/>
+        </w:tabs>
+        <w:ind w:left="1440" w:hanging="360"/>
+      </w:pPr>
+    </w:lvl>
+    <w:lvl w:ilvl="2" w:tentative="1">
+      <w:start w:val="1"/>
+      <w:numFmt w:val="decimal"/>
+      <w:lvlText w:val="%3."/>
+      <w:lvlJc w:val="left"/>
+      <w:pPr>
+        <w:tabs>
+          <w:tab w:val="num" w:pos="2160"/>
+        </w:tabs>
+        <w:ind w:left="2160" w:hanging="360"/>
+      </w:pPr>
+    </w:lvl>
+    <w:lvl w:ilvl="3" w:tentative="1">
+      <w:start w:val="1"/>
+      <w:numFmt w:val="decimal"/>
+      <w:lvlText w:val="%4."/>
+      <w:lvlJc w:val="left"/>
+      <w:pPr>
+        <w:tabs>
+          <w:tab w:val="num" w:pos="2880"/>
+        </w:tabs>
+        <w:ind w:left="2880" w:hanging="360"/>
+      </w:pPr>
+    </w:lvl>
+    <w:lvl w:ilvl="4" w:tentative="1">
+      <w:start w:val="1"/>
+      <w:numFmt w:val="decimal"/>
+      <w:lvlText w:val="%5."/>
+      <w:lvlJc w:val="left"/>
+      <w:pPr>
+        <w:tabs>
+          <w:tab w:val="num" w:pos="3600"/>
+        </w:tabs>
+        <w:ind w:left="3600" w:hanging="360"/>
+      </w:pPr>
+    </w:lvl>
+    <w:lvl w:ilvl="5" w:tentative="1">
+      <w:start w:val="1"/>
+      <w:numFmt w:val="decimal"/>
+      <w:lvlText w:val="%6."/>
+      <w:lvlJc w:val="left"/>
+      <w:pPr>
+        <w:tabs>
+          <w:tab w:val="num" w:pos="4320"/>
+        </w:tabs>
+        <w:ind w:left="4320" w:hanging="360"/>
+      </w:pPr>
+    </w:lvl>
+    <w:lvl w:ilvl="6" w:tentative="1">
+      <w:start w:val="1"/>
+      <w:numFmt w:val="decimal"/>
+      <w:lvlText w:val="%7."/>
+      <w:lvlJc w:val="left"/>
+      <w:pPr>
+        <w:tabs>
+          <w:tab w:val="num" w:pos="5040"/>
+        </w:tabs>
+        <w:ind w:left="5040" w:hanging="360"/>
+      </w:pPr>
+    </w:lvl>
+    <w:lvl w:ilvl="7" w:tentative="1">
+      <w:start w:val="1"/>
+      <w:numFmt w:val="decimal"/>
+      <w:lvlText w:val="%8."/>
+      <w:lvlJc w:val="left"/>
+      <w:pPr>
+        <w:tabs>
+          <w:tab w:val="num" w:pos="5760"/>
+        </w:tabs>
+        <w:ind w:left="5760" w:hanging="360"/>
+      </w:pPr>
+    </w:lvl>
+    <w:lvl w:ilvl="8" w:tentative="1">
+      <w:start w:val="1"/>
+      <w:numFmt w:val="decimal"/>
+      <w:lvlText w:val="%9."/>
+      <w:lvlJc w:val="left"/>
+      <w:pPr>
+        <w:tabs>
+          <w:tab w:val="num" w:pos="6480"/>
+        </w:tabs>
+        <w:ind w:left="6480" w:hanging="360"/>
+      </w:pPr>
+    </w:lvl>
+  </w:abstractNum>
+  <w:abstractNum w:abstractNumId="1" w15:restartNumberingAfterBreak="0">
+    <w:nsid w:val="1C1B7D46"/>
+    <w:multiLevelType w:val="multilevel"/>
+    <w:tmpl w:val="8ADED252"/>
+    <w:lvl w:ilvl="0">
+      <w:start w:val="1"/>
+      <w:numFmt w:val="decimal"/>
+      <w:lvlText w:val="%1."/>
+      <w:lvlJc w:val="left"/>
+      <w:pPr>
+        <w:tabs>
+          <w:tab w:val="num" w:pos="720"/>
+        </w:tabs>
+        <w:ind w:left="720" w:hanging="360"/>
+      </w:pPr>
+    </w:lvl>
+    <w:lvl w:ilvl="1" w:tentative="1">
+      <w:start w:val="1"/>
+      <w:numFmt w:val="decimal"/>
+      <w:lvlText w:val="%2."/>
+      <w:lvlJc w:val="left"/>
+      <w:pPr>
+        <w:tabs>
+          <w:tab w:val="num" w:pos="1440"/>
+        </w:tabs>
+        <w:ind w:left="1440" w:hanging="360"/>
+      </w:pPr>
+    </w:lvl>
+    <w:lvl w:ilvl="2" w:tentative="1">
+      <w:start w:val="1"/>
+      <w:numFmt w:val="decimal"/>
+      <w:lvlText w:val="%3."/>
+      <w:lvlJc w:val="left"/>
+      <w:pPr>
+        <w:tabs>
+          <w:tab w:val="num" w:pos="2160"/>
+        </w:tabs>
+        <w:ind w:left="2160" w:hanging="360"/>
+      </w:pPr>
+    </w:lvl>
+    <w:lvl w:ilvl="3" w:tentative="1">
+      <w:start w:val="1"/>
+      <w:numFmt w:val="decimal"/>
+      <w:lvlText w:val="%4."/>
+      <w:lvlJc w:val="left"/>
+      <w:pPr>
+        <w:tabs>
+          <w:tab w:val="num" w:pos="2880"/>
+        </w:tabs>
+        <w:ind w:left="2880" w:hanging="360"/>
+      </w:pPr>
+    </w:lvl>
+    <w:lvl w:ilvl="4" w:tentative="1">
+      <w:start w:val="1"/>
+      <w:numFmt w:val="decimal"/>
+      <w:lvlText w:val="%5."/>
+      <w:lvlJc w:val="left"/>
+      <w:pPr>
+        <w:tabs>
+          <w:tab w:val="num" w:pos="3600"/>
+        </w:tabs>
+        <w:ind w:left="3600" w:hanging="360"/>
+      </w:pPr>
+    </w:lvl>
+    <w:lvl w:ilvl="5" w:tentative="1">
+      <w:start w:val="1"/>
+      <w:numFmt w:val="decimal"/>
+      <w:lvlText w:val="%6."/>
+      <w:lvlJc w:val="left"/>
+      <w:pPr>
+        <w:tabs>
+          <w:tab w:val="num" w:pos="4320"/>
+        </w:tabs>
+        <w:ind w:left="4320" w:hanging="360"/>
+      </w:pPr>
+    </w:lvl>
+    <w:lvl w:ilvl="6" w:tentative="1">
+      <w:start w:val="1"/>
+      <w:numFmt w:val="decimal"/>
+      <w:lvlText w:val="%7."/>
+      <w:lvlJc w:val="left"/>
+      <w:pPr>
+        <w:tabs>
+          <w:tab w:val="num" w:pos="5040"/>
+        </w:tabs>
+        <w:ind w:left="5040" w:hanging="360"/>
+      </w:pPr>
+    </w:lvl>
+    <w:lvl w:ilvl="7" w:tentative="1">
+      <w:start w:val="1"/>
+      <w:numFmt w:val="decimal"/>
+      <w:lvlText w:val="%8."/>
+      <w:lvlJc w:val="left"/>
+      <w:pPr>
+        <w:tabs>
+          <w:tab w:val="num" w:pos="5760"/>
+        </w:tabs>
+        <w:ind w:left="5760" w:hanging="360"/>
+      </w:pPr>
+    </w:lvl>
+    <w:lvl w:ilvl="8" w:tentative="1">
+      <w:start w:val="1"/>
+      <w:numFmt w:val="decimal"/>
+      <w:lvlText w:val="%9."/>
+      <w:lvlJc w:val="left"/>
+      <w:pPr>
+        <w:tabs>
+          <w:tab w:val="num" w:pos="6480"/>
+        </w:tabs>
+        <w:ind w:left="6480" w:hanging="360"/>
+      </w:pPr>
+    </w:lvl>
+  </w:abstractNum>
+  <w:abstractNum w:abstractNumId="2" w15:restartNumberingAfterBreak="0">
+    <w:nsid w:val="1EFE28C1"/>
+    <w:multiLevelType w:val="multilevel"/>
+    <w:tmpl w:val="469A131A"/>
+    <w:lvl w:ilvl="0">
+      <w:start w:val="2"/>
+      <w:numFmt w:val="decimal"/>
+      <w:lvlText w:val="%1."/>
+      <w:lvlJc w:val="left"/>
+      <w:pPr>
+        <w:tabs>
+          <w:tab w:val="num" w:pos="720"/>
+        </w:tabs>
+        <w:ind w:left="720" w:hanging="360"/>
+      </w:pPr>
+    </w:lvl>
+    <w:lvl w:ilvl="1" w:tentative="1">
+      <w:start w:val="1"/>
+      <w:numFmt w:val="decimal"/>
+      <w:lvlText w:val="%2."/>
+      <w:lvlJc w:val="left"/>
+      <w:pPr>
+        <w:tabs>
+          <w:tab w:val="num" w:pos="1440"/>
+        </w:tabs>
+        <w:ind w:left="1440" w:hanging="360"/>
+      </w:pPr>
+    </w:lvl>
+    <w:lvl w:ilvl="2" w:tentative="1">
+      <w:start w:val="1"/>
+      <w:numFmt w:val="decimal"/>
+      <w:lvlText w:val="%3."/>
+      <w:lvlJc w:val="left"/>
+      <w:pPr>
+        <w:tabs>
+          <w:tab w:val="num" w:pos="2160"/>
+        </w:tabs>
+        <w:ind w:left="2160" w:hanging="360"/>
+      </w:pPr>
+    </w:lvl>
+    <w:lvl w:ilvl="3" w:tentative="1">
+      <w:start w:val="1"/>
+      <w:numFmt w:val="decimal"/>
+      <w:lvlText w:val="%4."/>
+      <w:lvlJc w:val="left"/>
+      <w:pPr>
+        <w:tabs>
+          <w:tab w:val="num" w:pos="2880"/>
+        </w:tabs>
+        <w:ind w:left="2880" w:hanging="360"/>
+      </w:pPr>
+    </w:lvl>
+    <w:lvl w:ilvl="4" w:tentative="1">
+      <w:start w:val="1"/>
+      <w:numFmt w:val="decimal"/>
+      <w:lvlText w:val="%5."/>
+      <w:lvlJc w:val="left"/>
+      <w:pPr>
+        <w:tabs>
+          <w:tab w:val="num" w:pos="3600"/>
+        </w:tabs>
+        <w:ind w:left="3600" w:hanging="360"/>
+      </w:pPr>
+    </w:lvl>
+    <w:lvl w:ilvl="5" w:tentative="1">
+      <w:start w:val="1"/>
+      <w:numFmt w:val="decimal"/>
+      <w:lvlText w:val="%6."/>
+      <w:lvlJc w:val="left"/>
+      <w:pPr>
+        <w:tabs>
+          <w:tab w:val="num" w:pos="4320"/>
+        </w:tabs>
+        <w:ind w:left="4320" w:hanging="360"/>
+      </w:pPr>
+    </w:lvl>
+    <w:lvl w:ilvl="6" w:tentative="1">
+      <w:start w:val="1"/>
+      <w:numFmt w:val="decimal"/>
+      <w:lvlText w:val="%7."/>
+      <w:lvlJc w:val="left"/>
+      <w:pPr>
+        <w:tabs>
+          <w:tab w:val="num" w:pos="5040"/>
+        </w:tabs>
+        <w:ind w:left="5040" w:hanging="360"/>
+      </w:pPr>
+    </w:lvl>
+    <w:lvl w:ilvl="7" w:tentative="1">
+      <w:start w:val="1"/>
+      <w:numFmt w:val="decimal"/>
+      <w:lvlText w:val="%8."/>
+      <w:lvlJc w:val="left"/>
+      <w:pPr>
+        <w:tabs>
+          <w:tab w:val="num" w:pos="5760"/>
+        </w:tabs>
+        <w:ind w:left="5760" w:hanging="360"/>
+      </w:pPr>
+    </w:lvl>
+    <w:lvl w:ilvl="8" w:tentative="1">
+      <w:start w:val="1"/>
+      <w:numFmt w:val="decimal"/>
+      <w:lvlText w:val="%9."/>
+      <w:lvlJc w:val="left"/>
+      <w:pPr>
+        <w:tabs>
+          <w:tab w:val="num" w:pos="6480"/>
+        </w:tabs>
+        <w:ind w:left="6480" w:hanging="360"/>
+      </w:pPr>
+    </w:lvl>
+  </w:abstractNum>
+  <w:abstractNum w:abstractNumId="3" w15:restartNumberingAfterBreak="0">
+    <w:nsid w:val="2309582D"/>
+    <w:multiLevelType w:val="multilevel"/>
+    <w:tmpl w:val="F15CFEEC"/>
+    <w:lvl w:ilvl="0">
+      <w:start w:val="1"/>
+      <w:numFmt w:val="decimal"/>
+      <w:lvlText w:val="%1."/>
+      <w:lvlJc w:val="left"/>
+      <w:pPr>
+        <w:tabs>
+          <w:tab w:val="num" w:pos="720"/>
+        </w:tabs>
+        <w:ind w:left="720" w:hanging="360"/>
+      </w:pPr>
+    </w:lvl>
+    <w:lvl w:ilvl="1" w:tentative="1">
+      <w:start w:val="1"/>
+      <w:numFmt w:val="decimal"/>
+      <w:lvlText w:val="%2."/>
+      <w:lvlJc w:val="left"/>
+      <w:pPr>
+        <w:tabs>
+          <w:tab w:val="num" w:pos="1440"/>
+        </w:tabs>
+        <w:ind w:left="1440" w:hanging="360"/>
+      </w:pPr>
+    </w:lvl>
+    <w:lvl w:ilvl="2" w:tentative="1">
+      <w:start w:val="1"/>
+      <w:numFmt w:val="decimal"/>
+      <w:lvlText w:val="%3."/>
+      <w:lvlJc w:val="left"/>
+      <w:pPr>
+        <w:tabs>
+          <w:tab w:val="num" w:pos="2160"/>
+        </w:tabs>
+        <w:ind w:left="2160" w:hanging="360"/>
+      </w:pPr>
+    </w:lvl>
+    <w:lvl w:ilvl="3" w:tentative="1">
+      <w:start w:val="1"/>
+      <w:numFmt w:val="decimal"/>
+      <w:lvlText w:val="%4."/>
+      <w:lvlJc w:val="left"/>
+      <w:pPr>
+        <w:tabs>
+          <w:tab w:val="num" w:pos="2880"/>
+        </w:tabs>
+        <w:ind w:left="2880" w:hanging="360"/>
+      </w:pPr>
+    </w:lvl>
+    <w:lvl w:ilvl="4" w:tentative="1">
+      <w:start w:val="1"/>
+      <w:numFmt w:val="decimal"/>
+      <w:lvlText w:val="%5."/>
+      <w:lvlJc w:val="left"/>
+      <w:pPr>
+        <w:tabs>
+          <w:tab w:val="num" w:pos="3600"/>
+        </w:tabs>
+        <w:ind w:left="3600" w:hanging="360"/>
+      </w:pPr>
+    </w:lvl>
+    <w:lvl w:ilvl="5" w:tentative="1">
+      <w:start w:val="1"/>
+      <w:numFmt w:val="decimal"/>
+      <w:lvlText w:val="%6."/>
+      <w:lvlJc w:val="left"/>
+      <w:pPr>
+        <w:tabs>
+          <w:tab w:val="num" w:pos="4320"/>
+        </w:tabs>
+        <w:ind w:left="4320" w:hanging="360"/>
+      </w:pPr>
+    </w:lvl>
+    <w:lvl w:ilvl="6" w:tentative="1">
+      <w:start w:val="1"/>
+      <w:numFmt w:val="decimal"/>
+      <w:lvlText w:val="%7."/>
+      <w:lvlJc w:val="left"/>
+      <w:pPr>
+        <w:tabs>
+          <w:tab w:val="num" w:pos="5040"/>
+        </w:tabs>
+        <w:ind w:left="5040" w:hanging="360"/>
+      </w:pPr>
+    </w:lvl>
+    <w:lvl w:ilvl="7" w:tentative="1">
+      <w:start w:val="1"/>
+      <w:numFmt w:val="decimal"/>
+      <w:lvlText w:val="%8."/>
+      <w:lvlJc w:val="left"/>
+      <w:pPr>
+        <w:tabs>
+          <w:tab w:val="num" w:pos="5760"/>
+        </w:tabs>
+        <w:ind w:left="5760" w:hanging="360"/>
+      </w:pPr>
+    </w:lvl>
+    <w:lvl w:ilvl="8" w:tentative="1">
+      <w:start w:val="1"/>
+      <w:numFmt w:val="decimal"/>
+      <w:lvlText w:val="%9."/>
+      <w:lvlJc w:val="left"/>
+      <w:pPr>
+        <w:tabs>
+          <w:tab w:val="num" w:pos="6480"/>
+        </w:tabs>
+        <w:ind w:left="6480" w:hanging="360"/>
+      </w:pPr>
+    </w:lvl>
+  </w:abstractNum>
+  <w:abstractNum w:abstractNumId="4" w15:restartNumberingAfterBreak="0">
     <w:nsid w:val="26AC5794"/>
     <w:multiLevelType w:val="hybridMultilevel"/>
     <w:tmpl w:val="D132E8DC"/>
@@ -1089,7 +1546,7 @@
       </w:pPr>
     </w:lvl>
   </w:abstractNum>
-  <w:abstractNum w:abstractNumId="1" w15:restartNumberingAfterBreak="0">
+  <w:abstractNum w:abstractNumId="5" w15:restartNumberingAfterBreak="0">
     <w:nsid w:val="339232D1"/>
     <w:multiLevelType w:val="hybridMultilevel"/>
     <w:tmpl w:val="90B4C6E2"/>
@@ -1175,7 +1632,120 @@
       </w:pPr>
     </w:lvl>
   </w:abstractNum>
-  <w:abstractNum w:abstractNumId="2" w15:restartNumberingAfterBreak="0">
+  <w:abstractNum w:abstractNumId="6" w15:restartNumberingAfterBreak="0">
+    <w:nsid w:val="3CAF48DE"/>
+    <w:multiLevelType w:val="multilevel"/>
+    <w:tmpl w:val="51D23B38"/>
+    <w:lvl w:ilvl="0">
+      <w:start w:val="1"/>
+      <w:numFmt w:val="decimal"/>
+      <w:lvlText w:val="%1."/>
+      <w:lvlJc w:val="left"/>
+      <w:pPr>
+        <w:tabs>
+          <w:tab w:val="num" w:pos="720"/>
+        </w:tabs>
+        <w:ind w:left="720" w:hanging="360"/>
+      </w:pPr>
+    </w:lvl>
+    <w:lvl w:ilvl="1" w:tentative="1">
+      <w:start w:val="1"/>
+      <w:numFmt w:val="decimal"/>
+      <w:lvlText w:val="%2."/>
+      <w:lvlJc w:val="left"/>
+      <w:pPr>
+        <w:tabs>
+          <w:tab w:val="num" w:pos="1440"/>
+        </w:tabs>
+        <w:ind w:left="1440" w:hanging="360"/>
+      </w:pPr>
+    </w:lvl>
+    <w:lvl w:ilvl="2" w:tentative="1">
+      <w:start w:val="1"/>
+      <w:numFmt w:val="decimal"/>
+      <w:lvlText w:val="%3."/>
+      <w:lvlJc w:val="left"/>
+      <w:pPr>
+        <w:tabs>
+          <w:tab w:val="num" w:pos="2160"/>
+        </w:tabs>
+        <w:ind w:left="2160" w:hanging="360"/>
+      </w:pPr>
+    </w:lvl>
+    <w:lvl w:ilvl="3" w:tentative="1">
+      <w:start w:val="1"/>
+      <w:numFmt w:val="decimal"/>
+      <w:lvlText w:val="%4."/>
+      <w:lvlJc w:val="left"/>
+      <w:pPr>
+        <w:tabs>
+          <w:tab w:val="num" w:pos="2880"/>
+        </w:tabs>
+        <w:ind w:left="2880" w:hanging="360"/>
+      </w:pPr>
+    </w:lvl>
+    <w:lvl w:ilvl="4" w:tentative="1">
+      <w:start w:val="1"/>
+      <w:numFmt w:val="decimal"/>
+      <w:lvlText w:val="%5."/>
+      <w:lvlJc w:val="left"/>
+      <w:pPr>
+        <w:tabs>
+          <w:tab w:val="num" w:pos="3600"/>
+        </w:tabs>
+        <w:ind w:left="3600" w:hanging="360"/>
+      </w:pPr>
+    </w:lvl>
+    <w:lvl w:ilvl="5" w:tentative="1">
+      <w:start w:val="1"/>
+      <w:numFmt w:val="decimal"/>
+      <w:lvlText w:val="%6."/>
+      <w:lvlJc w:val="left"/>
+      <w:pPr>
+        <w:tabs>
+          <w:tab w:val="num" w:pos="4320"/>
+        </w:tabs>
+        <w:ind w:left="4320" w:hanging="360"/>
+      </w:pPr>
+    </w:lvl>
+    <w:lvl w:ilvl="6" w:tentative="1">
+      <w:start w:val="1"/>
+      <w:numFmt w:val="decimal"/>
+      <w:lvlText w:val="%7."/>
+      <w:lvlJc w:val="left"/>
+      <w:pPr>
+        <w:tabs>
+          <w:tab w:val="num" w:pos="5040"/>
+        </w:tabs>
+        <w:ind w:left="5040" w:hanging="360"/>
+      </w:pPr>
+    </w:lvl>
+    <w:lvl w:ilvl="7" w:tentative="1">
+      <w:start w:val="1"/>
+      <w:numFmt w:val="decimal"/>
+      <w:lvlText w:val="%8."/>
+      <w:lvlJc w:val="left"/>
+      <w:pPr>
+        <w:tabs>
+          <w:tab w:val="num" w:pos="5760"/>
+        </w:tabs>
+        <w:ind w:left="5760" w:hanging="360"/>
+      </w:pPr>
+    </w:lvl>
+    <w:lvl w:ilvl="8" w:tentative="1">
+      <w:start w:val="1"/>
+      <w:numFmt w:val="decimal"/>
+      <w:lvlText w:val="%9."/>
+      <w:lvlJc w:val="left"/>
+      <w:pPr>
+        <w:tabs>
+          <w:tab w:val="num" w:pos="6480"/>
+        </w:tabs>
+        <w:ind w:left="6480" w:hanging="360"/>
+      </w:pPr>
+    </w:lvl>
+  </w:abstractNum>
+  <w:abstractNum w:abstractNumId="7" w15:restartNumberingAfterBreak="0">
     <w:nsid w:val="509F3479"/>
     <w:multiLevelType w:val="hybridMultilevel"/>
     <w:tmpl w:val="8A2E75B8"/>
@@ -1261,7 +1831,7 @@
       </w:pPr>
     </w:lvl>
   </w:abstractNum>
-  <w:abstractNum w:abstractNumId="3" w15:restartNumberingAfterBreak="0">
+  <w:abstractNum w:abstractNumId="8" w15:restartNumberingAfterBreak="0">
     <w:nsid w:val="64B2437A"/>
     <w:multiLevelType w:val="hybridMultilevel"/>
     <w:tmpl w:val="2A3A4324"/>
@@ -1350,7 +1920,7 @@
       </w:pPr>
     </w:lvl>
   </w:abstractNum>
-  <w:abstractNum w:abstractNumId="4" w15:restartNumberingAfterBreak="0">
+  <w:abstractNum w:abstractNumId="9" w15:restartNumberingAfterBreak="0">
     <w:nsid w:val="6535606D"/>
     <w:multiLevelType w:val="hybridMultilevel"/>
     <w:tmpl w:val="4B2C6E38"/>
@@ -1439,7 +2009,7 @@
       </w:pPr>
     </w:lvl>
   </w:abstractNum>
-  <w:abstractNum w:abstractNumId="5" w15:restartNumberingAfterBreak="0">
+  <w:abstractNum w:abstractNumId="10" w15:restartNumberingAfterBreak="0">
     <w:nsid w:val="7E4E3B71"/>
     <w:multiLevelType w:val="hybridMultilevel"/>
     <w:tmpl w:val="3FAE73A6"/>
@@ -1526,22 +2096,54 @@
     </w:lvl>
   </w:abstractNum>
   <w:num w:numId="1">
+    <w:abstractNumId w:val="9"/>
+  </w:num>
+  <w:num w:numId="2">
     <w:abstractNumId w:val="4"/>
   </w:num>
-  <w:num w:numId="2">
-    <w:abstractNumId w:val="0"/>
+  <w:num w:numId="3">
+    <w:abstractNumId w:val="8"/>
   </w:num>
-  <w:num w:numId="3">
+  <w:num w:numId="4">
+    <w:abstractNumId w:val="10"/>
+  </w:num>
+  <w:num w:numId="5">
+    <w:abstractNumId w:val="5"/>
+  </w:num>
+  <w:num w:numId="6">
+    <w:abstractNumId w:val="7"/>
+  </w:num>
+  <w:num w:numId="7">
+    <w:abstractNumId w:val="6"/>
+  </w:num>
+  <w:num w:numId="8">
+    <w:abstractNumId w:val="1"/>
+  </w:num>
+  <w:num w:numId="9">
     <w:abstractNumId w:val="3"/>
   </w:num>
-  <w:num w:numId="4">
-    <w:abstractNumId w:val="5"/>
+  <w:num w:numId="10">
+    <w:abstractNumId w:val="2"/>
+    <w:lvlOverride w:ilvl="0">
+      <w:lvl w:ilvl="0">
+        <w:numFmt w:val="decimal"/>
+        <w:lvlText w:val="%1."/>
+        <w:lvlJc w:val="left"/>
+      </w:lvl>
+    </w:lvlOverride>
   </w:num>
-  <w:num w:numId="5">
-    <w:abstractNumId w:val="1"/>
+  <w:num w:numId="11">
+    <w:abstractNumId w:val="2"/>
+    <w:lvlOverride w:ilvl="0">
+      <w:lvl w:ilvl="0">
+        <w:numFmt w:val="decimal"/>
+        <w:lvlText w:val="%1."/>
+        <w:lvlJc w:val="left"/>
+      </w:lvl>
+    </w:lvlOverride>
   </w:num>
-  <w:num w:numId="6">
-    <w:abstractNumId w:val="2"/>
+  <w:num w:numId="12">
+    <w:abstractNumId w:val="0"/>
   </w:num>
 </w:numbering>
 </file>
@@ -2500,6 +3102,24 @@
       <w:shd w:val="clear" w:color="auto" w:fill="E1DFDD"/>
     </w:rPr>
   </w:style>
+  <w:style w:type="paragraph" w:styleId="af">
+    <w:name w:val="Normal (Web)"/>
+    <w:basedOn w:val="a"/>
+    <w:uiPriority w:val="99"/>
+    <w:semiHidden/>
+    <w:unhideWhenUsed/>
+    <w:rsid w:val="00653233"/>
+    <w:pPr>
+      <w:spacing w:before="100" w:beforeAutospacing="1" w:after="100" w:afterAutospacing="1" w:line="240" w:lineRule="auto"/>
+      <w:ind w:firstLine="0"/>
+    </w:pPr>
+    <w:rPr>
+      <w:rFonts w:eastAsia="Times New Roman" w:cs="Times New Roman"/>
+      <w:kern w:val="0"/>
+      <w:lang w:eastAsia="ru-RU"/>
+      <w14:ligatures w14:val="none"/>
+    </w:rPr>
+  </w:style>
 </w:styles>
 </file>
 

</xml_diff>

<commit_message>
feat: add closed shelves chapter (levels 13-16)
FourthLevel scene with closed shelves, unlock conditions, triple refill,
covers, markers, intro hint and audio; levels 13-16 with menu cards;
campaign and play mode validation for 16 levels; design and plan docs.
</commit_message>
<xml_diff>
--- a/Assets/ГДД.docx
+++ b/Assets/ГДД.docx
@@ -490,7 +490,7 @@
           <v:shape id="_x0000_i1025" type="#_x0000_t75" style="width:170.25pt;height:401.25pt" o:ole="">
             <v:imagedata r:id="rId6" o:title=""/>
           </v:shape>
-          <o:OLEObject Type="Embed" ProgID="Visio.Drawing.15" ShapeID="_x0000_i1025" DrawAspect="Content" ObjectID="_1850845967" r:id="rId7"/>
+          <o:OLEObject Type="Embed" ProgID="Visio.Drawing.15" ShapeID="_x0000_i1025" DrawAspect="Content" ObjectID="_1851467160" r:id="rId7"/>
         </w:object>
       </w:r>
     </w:p>
@@ -541,7 +541,7 @@
           <v:shape id="_x0000_i1026" type="#_x0000_t75" style="width:437.25pt;height:263.25pt" o:ole="">
             <v:imagedata r:id="rId8" o:title=""/>
           </v:shape>
-          <o:OLEObject Type="Embed" ProgID="Visio.Drawing.15" ShapeID="_x0000_i1026" DrawAspect="Content" ObjectID="_1850845968" r:id="rId9"/>
+          <o:OLEObject Type="Embed" ProgID="Visio.Drawing.15" ShapeID="_x0000_i1026" DrawAspect="Content" ObjectID="_1851467161" r:id="rId9"/>
         </w:object>
       </w:r>
     </w:p>
@@ -583,7 +583,7 @@
           <v:shape id="_x0000_i1027" type="#_x0000_t75" style="width:443.25pt;height:266.25pt" o:ole="">
             <v:imagedata r:id="rId10" o:title=""/>
           </v:shape>
-          <o:OLEObject Type="Embed" ProgID="Visio.Drawing.15" ShapeID="_x0000_i1027" DrawAspect="Content" ObjectID="_1850845969" r:id="rId11"/>
+          <o:OLEObject Type="Embed" ProgID="Visio.Drawing.15" ShapeID="_x0000_i1027" DrawAspect="Content" ObjectID="_1851467162" r:id="rId11"/>
         </w:object>
       </w:r>
     </w:p>
@@ -618,7 +618,7 @@
           <v:shape id="_x0000_i1028" type="#_x0000_t75" style="width:282.75pt;height:190.5pt" o:ole="">
             <v:imagedata r:id="rId12" o:title=""/>
           </v:shape>
-          <o:OLEObject Type="Embed" ProgID="Visio.Drawing.15" ShapeID="_x0000_i1028" DrawAspect="Content" ObjectID="_1850845970" r:id="rId13"/>
+          <o:OLEObject Type="Embed" ProgID="Visio.Drawing.15" ShapeID="_x0000_i1028" DrawAspect="Content" ObjectID="_1851467163" r:id="rId13"/>
         </w:object>
       </w:r>
     </w:p>
@@ -993,6 +993,320 @@
         <w:t xml:space="preserve"> (такую нельзя пропустить, либо в противном случае просмотр не вознаградится). Баннерная реклама будет отображаться внизу уровня.</w:t>
       </w:r>
     </w:p>
+    <w:p>
+      <w:r>
+        <w:br w:type="page"/>
+      </w:r>
+    </w:p>
+    <w:p>
+      <w:pPr>
+        <w:pStyle w:val="1"/>
+        <w:jc w:val="center"/>
+        <w:rPr>
+          <w:color w:val="000000"/>
+          <w:sz w:val="28"/>
+          <w:szCs w:val="28"/>
+        </w:rPr>
+      </w:pPr>
+      <w:r>
+        <w:rPr>
+          <w:color w:val="000000"/>
+          <w:sz w:val="28"/>
+          <w:szCs w:val="28"/>
+        </w:rPr>
+        <w:lastRenderedPageBreak/>
+        <w:t>Модификации и изменения</w:t>
+      </w:r>
+    </w:p>
+    <w:p>
+      <w:pPr>
+        <w:pStyle w:val="af"/>
+        <w:spacing w:before="0" w:beforeAutospacing="0" w:after="0" w:afterAutospacing="0"/>
+        <w:ind w:firstLine="709"/>
+        <w:jc w:val="both"/>
+        <w:rPr>
+          <w:color w:val="000000"/>
+        </w:rPr>
+      </w:pPr>
+      <w:r>
+        <w:rPr>
+          <w:color w:val="000000"/>
+        </w:rPr>
+        <w:t>Следующие изменения были придуманы после реализации главной части ГДД для улучшения игрового опыта и увеличения среднего игрового времени в игре.</w:t>
+      </w:r>
+      <w:r>
+        <w:rPr>
+          <w:color w:val="000000"/>
+        </w:rPr>
+        <w:br/>
+      </w:r>
+      <w:r>
+        <w:rPr>
+          <w:color w:val="000000"/>
+        </w:rPr>
+        <w:br/>
+        <w:t>Новые</w:t>
+      </w:r>
+      <w:r>
+        <w:rPr>
+          <w:color w:val="000000"/>
+          <w:lang w:val="en-US"/>
+        </w:rPr>
+        <w:t xml:space="preserve"> </w:t>
+      </w:r>
+      <w:r>
+        <w:rPr>
+          <w:color w:val="000000"/>
+        </w:rPr>
+        <w:t>механики:</w:t>
+      </w:r>
+    </w:p>
+    <w:p>
+      <w:pPr>
+        <w:pStyle w:val="af"/>
+        <w:numPr>
+          <w:ilvl w:val="0"/>
+          <w:numId w:val="13"/>
+        </w:numPr>
+        <w:spacing w:before="0" w:beforeAutospacing="0" w:after="0" w:afterAutospacing="0"/>
+        <w:jc w:val="both"/>
+      </w:pPr>
+      <w:r>
+        <w:rPr>
+          <w:color w:val="000000"/>
+        </w:rPr>
+        <w:t>Система звезд;</w:t>
+      </w:r>
+    </w:p>
+    <w:p>
+      <w:pPr>
+        <w:pStyle w:val="af"/>
+        <w:numPr>
+          <w:ilvl w:val="0"/>
+          <w:numId w:val="13"/>
+        </w:numPr>
+        <w:spacing w:before="0" w:beforeAutospacing="0" w:after="0" w:afterAutospacing="0"/>
+        <w:jc w:val="both"/>
+      </w:pPr>
+      <w:r>
+        <w:rPr>
+          <w:color w:val="000000"/>
+        </w:rPr>
+        <w:t>Возможность менять местами взятый предмет с лежащим на полке (можно будет одним действием выполнить сразу 2 мэтча);</w:t>
+      </w:r>
+    </w:p>
+    <w:p>
+      <w:pPr>
+        <w:pStyle w:val="af"/>
+        <w:numPr>
+          <w:ilvl w:val="0"/>
+          <w:numId w:val="13"/>
+        </w:numPr>
+        <w:spacing w:before="0" w:beforeAutospacing="0" w:after="0" w:afterAutospacing="0"/>
+        <w:jc w:val="both"/>
+        <w:rPr>
+          <w:highlight w:val="yellow"/>
+        </w:rPr>
+      </w:pPr>
+      <w:r>
+        <w:rPr>
+          <w:highlight w:val="yellow"/>
+        </w:rPr>
+        <w:t xml:space="preserve">? </w:t>
+      </w:r>
+      <w:r>
+        <w:rPr>
+          <w:highlight w:val="yellow"/>
+        </w:rPr>
+        <w:t>Заменить текущие бонусы на</w:t>
+      </w:r>
+      <w:r>
+        <w:rPr>
+          <w:highlight w:val="yellow"/>
+        </w:rPr>
+        <w:t xml:space="preserve"> предуровневые бонусы (как в условном </w:t>
+      </w:r>
+      <w:r>
+        <w:rPr>
+          <w:highlight w:val="yellow"/>
+          <w:lang w:val="en-US"/>
+        </w:rPr>
+        <w:t>Subway</w:t>
+      </w:r>
+      <w:r>
+        <w:rPr>
+          <w:highlight w:val="yellow"/>
+        </w:rPr>
+        <w:t xml:space="preserve"> </w:t>
+      </w:r>
+      <w:r>
+        <w:rPr>
+          <w:highlight w:val="yellow"/>
+          <w:lang w:val="en-US"/>
+        </w:rPr>
+        <w:t>Surf</w:t>
+      </w:r>
+      <w:r>
+        <w:rPr>
+          <w:highlight w:val="yellow"/>
+        </w:rPr>
+        <w:t>). Игрок выбирает бонус на старт, например, стартовое комбо +</w:t>
+      </w:r>
+      <w:r>
+        <w:rPr>
+          <w:highlight w:val="yellow"/>
+          <w:lang w:val="en-US"/>
+        </w:rPr>
+        <w:t>x</w:t>
+      </w:r>
+      <w:r>
+        <w:rPr>
+          <w:highlight w:val="yellow"/>
+        </w:rPr>
+        <w:t>5 или автоматическое наилучшее перемещение первых 5 предметов</w:t>
+      </w:r>
+      <w:r>
+        <w:rPr>
+          <w:highlight w:val="yellow"/>
+        </w:rPr>
+        <w:t>, заморозку при первом потерянном множителе комбо.</w:t>
+      </w:r>
+      <w:r>
+        <w:rPr>
+          <w:highlight w:val="yellow"/>
+        </w:rPr>
+        <w:t xml:space="preserve"> ?</w:t>
+      </w:r>
+    </w:p>
+    <w:p>
+      <w:pPr>
+        <w:pStyle w:val="af"/>
+        <w:numPr>
+          <w:ilvl w:val="0"/>
+          <w:numId w:val="13"/>
+        </w:numPr>
+        <w:spacing w:before="0" w:beforeAutospacing="0" w:after="0" w:afterAutospacing="0"/>
+        <w:jc w:val="both"/>
+      </w:pPr>
+      <w:r>
+        <w:t>Внедрить экономику – один тип валюты (монеты).</w:t>
+      </w:r>
+    </w:p>
+    <w:p>
+      <w:pPr>
+        <w:pStyle w:val="af"/>
+        <w:numPr>
+          <w:ilvl w:val="1"/>
+          <w:numId w:val="13"/>
+        </w:numPr>
+        <w:spacing w:before="0" w:beforeAutospacing="0" w:after="0" w:afterAutospacing="0"/>
+        <w:jc w:val="both"/>
+      </w:pPr>
+      <w:r>
+        <w:t>Добавить задания на уровень/общие задания на день за которые можно заработать валюту (</w:t>
+      </w:r>
+      <w:r>
+        <w:t xml:space="preserve">пройти уровень за </w:t>
+      </w:r>
+      <w:r>
+        <w:rPr>
+          <w:lang w:val="en-US"/>
+        </w:rPr>
+        <w:t>N</w:t>
+      </w:r>
+      <w:r>
+        <w:t xml:space="preserve"> </w:t>
+      </w:r>
+      <w:r>
+        <w:t>секунд</w:t>
+      </w:r>
+      <w:r>
+        <w:t xml:space="preserve">, пройти уровень не снижая множитель комбо, выполнить 2 мэтча заменой </w:t>
+      </w:r>
+      <w:r>
+        <w:rPr>
+          <w:lang w:val="en-US"/>
+        </w:rPr>
+        <w:t>N</w:t>
+      </w:r>
+      <w:r>
+        <w:t xml:space="preserve"> раз / выполнить </w:t>
+      </w:r>
+      <w:r>
+        <w:rPr>
+          <w:lang w:val="en-US"/>
+        </w:rPr>
+        <w:t>N</w:t>
+      </w:r>
+      <w:r>
+        <w:t xml:space="preserve"> мэтчей </w:t>
+      </w:r>
+      <w:r>
+        <w:rPr>
+          <w:lang w:val="en-US"/>
+        </w:rPr>
+        <w:t>X</w:t>
+      </w:r>
+      <w:r>
+        <w:t xml:space="preserve"> </w:t>
+      </w:r>
+      <w:r>
+        <w:t xml:space="preserve">типа предмета, набрать </w:t>
+      </w:r>
+      <w:r>
+        <w:rPr>
+          <w:lang w:val="en-US"/>
+        </w:rPr>
+        <w:t>N</w:t>
+      </w:r>
+      <w:r>
+        <w:t xml:space="preserve"> </w:t>
+      </w:r>
+      <w:r>
+        <w:t>очков в бесконечном уровне).</w:t>
+      </w:r>
+    </w:p>
+    <w:p>
+      <w:pPr>
+        <w:pStyle w:val="af"/>
+        <w:numPr>
+          <w:ilvl w:val="1"/>
+          <w:numId w:val="13"/>
+        </w:numPr>
+        <w:spacing w:before="0" w:beforeAutospacing="0" w:after="0" w:afterAutospacing="0"/>
+        <w:jc w:val="both"/>
+      </w:pPr>
+      <w:r>
+        <w:t>Добавить магазин для траты монет на бонусы, скины на типы предметов.</w:t>
+      </w:r>
+    </w:p>
+    <w:p>
+      <w:pPr>
+        <w:pStyle w:val="af"/>
+        <w:numPr>
+          <w:ilvl w:val="0"/>
+          <w:numId w:val="13"/>
+        </w:numPr>
+        <w:spacing w:before="0" w:beforeAutospacing="0" w:after="0" w:afterAutospacing="0"/>
+        <w:jc w:val="both"/>
+      </w:pPr>
+      <w:r>
+        <w:t xml:space="preserve">Новый бонус только для бесконечного уровня – вторая жизнь. Когда у игрока кончается время появляется окно с предложением купить продолжить ран за просмотр рекламы, либо за </w:t>
+      </w:r>
+      <w:r>
+        <w:rPr>
+          <w:lang w:val="en-US"/>
+        </w:rPr>
+        <w:t>N</w:t>
+      </w:r>
+      <w:r>
+        <w:t xml:space="preserve"> </w:t>
+      </w:r>
+      <w:r>
+        <w:t>монет. Вторую жизнь можно использовать лишь раз за ран.</w:t>
+      </w:r>
+    </w:p>
+    <w:p/>
     <w:sectPr>
       <w:pgSz w:w="11906" w:h="16838"/>
       <w:pgMar w:top="1134" w:right="850" w:bottom="1134" w:left="1701" w:header="708" w:footer="708" w:gutter="0"/>
@@ -2010,6 +2324,92 @@
     </w:lvl>
   </w:abstractNum>
   <w:abstractNum w:abstractNumId="10" w15:restartNumberingAfterBreak="0">
+    <w:nsid w:val="67BD1A71"/>
+    <w:multiLevelType w:val="multilevel"/>
+    <w:tmpl w:val="0419001D"/>
+    <w:lvl w:ilvl="0">
+      <w:start w:val="1"/>
+      <w:numFmt w:val="decimal"/>
+      <w:lvlText w:val="%1)"/>
+      <w:lvlJc w:val="left"/>
+      <w:pPr>
+        <w:ind w:left="360" w:hanging="360"/>
+      </w:pPr>
+    </w:lvl>
+    <w:lvl w:ilvl="1">
+      <w:start w:val="1"/>
+      <w:numFmt w:val="lowerLetter"/>
+      <w:lvlText w:val="%2)"/>
+      <w:lvlJc w:val="left"/>
+      <w:pPr>
+        <w:ind w:left="720" w:hanging="360"/>
+      </w:pPr>
+    </w:lvl>
+    <w:lvl w:ilvl="2">
+      <w:start w:val="1"/>
+      <w:numFmt w:val="lowerRoman"/>
+      <w:lvlText w:val="%3)"/>
+      <w:lvlJc w:val="left"/>
+      <w:pPr>
+        <w:ind w:left="1080" w:hanging="360"/>
+      </w:pPr>
+    </w:lvl>
+    <w:lvl w:ilvl="3">
+      <w:start w:val="1"/>
+      <w:numFmt w:val="decimal"/>
+      <w:lvlText w:val="(%4)"/>
+      <w:lvlJc w:val="left"/>
+      <w:pPr>
+        <w:ind w:left="1440" w:hanging="360"/>
+      </w:pPr>
+    </w:lvl>
+    <w:lvl w:ilvl="4">
+      <w:start w:val="1"/>
+      <w:numFmt w:val="lowerLetter"/>
+      <w:lvlText w:val="(%5)"/>
+      <w:lvlJc w:val="left"/>
+      <w:pPr>
+        <w:ind w:left="1800" w:hanging="360"/>
+      </w:pPr>
+    </w:lvl>
+    <w:lvl w:ilvl="5">
+      <w:start w:val="1"/>
+      <w:numFmt w:val="lowerRoman"/>
+      <w:lvlText w:val="(%6)"/>
+      <w:lvlJc w:val="left"/>
+      <w:pPr>
+        <w:ind w:left="2160" w:hanging="360"/>
+      </w:pPr>
+    </w:lvl>
+    <w:lvl w:ilvl="6">
+      <w:start w:val="1"/>
+      <w:numFmt w:val="decimal"/>
+      <w:lvlText w:val="%7."/>
+      <w:lvlJc w:val="left"/>
+      <w:pPr>
+        <w:ind w:left="2520" w:hanging="360"/>
+      </w:pPr>
+    </w:lvl>
+    <w:lvl w:ilvl="7">
+      <w:start w:val="1"/>
+      <w:numFmt w:val="lowerLetter"/>
+      <w:lvlText w:val="%8."/>
+      <w:lvlJc w:val="left"/>
+      <w:pPr>
+        <w:ind w:left="2880" w:hanging="360"/>
+      </w:pPr>
+    </w:lvl>
+    <w:lvl w:ilvl="8">
+      <w:start w:val="1"/>
+      <w:numFmt w:val="lowerRoman"/>
+      <w:lvlText w:val="%9."/>
+      <w:lvlJc w:val="left"/>
+      <w:pPr>
+        <w:ind w:left="3240" w:hanging="360"/>
+      </w:pPr>
+    </w:lvl>
+  </w:abstractNum>
+  <w:abstractNum w:abstractNumId="11" w15:restartNumberingAfterBreak="0">
     <w:nsid w:val="7E4E3B71"/>
     <w:multiLevelType w:val="hybridMultilevel"/>
     <w:tmpl w:val="3FAE73A6"/>
@@ -2105,7 +2505,7 @@
     <w:abstractNumId w:val="8"/>
   </w:num>
   <w:num w:numId="4">
-    <w:abstractNumId w:val="10"/>
+    <w:abstractNumId w:val="11"/>
   </w:num>
   <w:num w:numId="5">
     <w:abstractNumId w:val="5"/>
@@ -2144,6 +2544,9 @@
   </w:num>
   <w:num w:numId="12">
     <w:abstractNumId w:val="0"/>
+  </w:num>
+  <w:num w:numId="13">
+    <w:abstractNumId w:val="10"/>
   </w:num>
 </w:numbering>
 </file>
@@ -3106,7 +3509,6 @@
     <w:name w:val="Normal (Web)"/>
     <w:basedOn w:val="a"/>
     <w:uiPriority w:val="99"/>
-    <w:semiHidden/>
     <w:unhideWhenUsed/>
     <w:rsid w:val="00653233"/>
     <w:pPr>

</xml_diff>